<commit_message>
resume6: add Off The Record podcast link (otr.podcast.pit.world)
Co-Authored-By: Claude Opus 5.5 <noreply@anthropic.com>
</commit_message>
<xml_diff>
--- a/anthony.ettinger.resume6.docx
+++ b/anthony.ettinger.resume6.docx
@@ -7,6 +7,9 @@
         <w:pStyle w:val="Title"/>
       </w:pPr>
       <w:r>
+        <w:rPr>
+          <w:lang w:val="en"/>
+        </w:rPr>
         <w:t xml:space="preserve">Anthony Ettinger - Resume</w:t>
       </w:r>
     </w:p>
@@ -16,6 +19,9 @@
         <w:pStyle w:val="Heading2"/>
       </w:pPr>
       <w:r>
+        <w:rPr>
+          <w:lang w:val="en"/>
+        </w:rPr>
         <w:t xml:space="preserve">Selected Projects</w:t>
       </w:r>
     </w:p>
@@ -27,13 +33,20 @@
         <w:rPr>
           <w:b/>
           <w:bCs/>
+          <w:lang w:val="en"/>
         </w:rPr>
         <w:t xml:space="preserve">CrawlProof</w:t>
       </w:r>
       <w:r>
-        <w:t xml:space="preserve"> </w:t>
-      </w:r>
-      <w:r>
+        <w:rPr>
+          <w:lang w:val="en"/>
+        </w:rPr>
+        <w:t xml:space="preserve"> </w:t>
+      </w:r>
+      <w:r>
+        <w:rPr>
+          <w:lang w:val="en"/>
+        </w:rPr>
         <w:t xml:space="preserve">(crawlproof.com)</w:t>
       </w:r>
     </w:p>
@@ -42,6 +55,9 @@
         <w:pStyle w:val="BodyText"/>
       </w:pPr>
       <w:r>
+        <w:rPr>
+          <w:lang w:val="en"/>
+        </w:rPr>
         <w:t xml:space="preserve">AI Engine Optimization (AEO) tracking. Measures how a brand shows up in AI answers, auto-posts to the customer's blog and runs a backlink exchange.</w:t>
       </w:r>
     </w:p>
@@ -53,13 +69,20 @@
         <w:rPr>
           <w:b/>
           <w:bCs/>
+          <w:lang w:val="en"/>
         </w:rPr>
         <w:t xml:space="preserve">CoinPay</w:t>
       </w:r>
       <w:r>
-        <w:t xml:space="preserve"> </w:t>
-      </w:r>
-      <w:r>
+        <w:rPr>
+          <w:lang w:val="en"/>
+        </w:rPr>
+        <w:t xml:space="preserve"> </w:t>
+      </w:r>
+      <w:r>
+        <w:rPr>
+          <w:lang w:val="en"/>
+        </w:rPr>
         <w:t xml:space="preserve">(coinpayportal.com)</w:t>
       </w:r>
     </w:p>
@@ -68,6 +91,9 @@
         <w:pStyle w:val="BodyText"/>
       </w:pPr>
       <w:r>
+        <w:rPr>
+          <w:lang w:val="en"/>
+        </w:rPr>
         <w:t xml:space="preserve">Non-custodial crypto payment gateway. Merchant accounts, checkout, webhooks, escrow, invoices, proposals, and x402 pay-per-request for AI agents and crawlers.</w:t>
       </w:r>
     </w:p>
@@ -79,13 +105,20 @@
         <w:rPr>
           <w:b/>
           <w:bCs/>
+          <w:lang w:val="en"/>
         </w:rPr>
         <w:t xml:space="preserve">Agentic Jobs</w:t>
       </w:r>
       <w:r>
-        <w:t xml:space="preserve"> </w:t>
-      </w:r>
-      <w:r>
+        <w:rPr>
+          <w:lang w:val="en"/>
+        </w:rPr>
+        <w:t xml:space="preserve"> </w:t>
+      </w:r>
+      <w:r>
+        <w:rPr>
+          <w:lang w:val="en"/>
+        </w:rPr>
         <w:t xml:space="preserve">(agenticjobs.work)</w:t>
       </w:r>
     </w:p>
@@ -94,6 +127,9 @@
         <w:pStyle w:val="BodyText"/>
       </w:pPr>
       <w:r>
+        <w:rPr>
+          <w:lang w:val="en"/>
+        </w:rPr>
         <w:t xml:space="preserve">Federated, agent-friendly job board where agents hire agents with a person approving at both ends. Web, REST, MCP, CLI, TUI and PWA on one engine.</w:t>
       </w:r>
     </w:p>
@@ -105,13 +141,20 @@
         <w:rPr>
           <w:b/>
           <w:bCs/>
+          <w:lang w:val="en"/>
         </w:rPr>
         <w:t xml:space="preserve">ThreatCrush</w:t>
       </w:r>
       <w:r>
-        <w:t xml:space="preserve"> </w:t>
-      </w:r>
-      <w:r>
+        <w:rPr>
+          <w:lang w:val="en"/>
+        </w:rPr>
+        <w:t xml:space="preserve"> </w:t>
+      </w:r>
+      <w:r>
+        <w:rPr>
+          <w:lang w:val="en"/>
+        </w:rPr>
         <w:t xml:space="preserve">(threatcrush.com)</w:t>
       </w:r>
     </w:p>
@@ -120,6 +163,9 @@
         <w:pStyle w:val="BodyText"/>
       </w:pPr>
       <w:r>
+        <w:rPr>
+          <w:lang w:val="en"/>
+        </w:rPr>
         <w:t xml:space="preserve">Open-source security automation. Threat intelligence, CTEM checklists and an auto-defence daemon for developers.</w:t>
       </w:r>
     </w:p>
@@ -131,6 +177,7 @@
         <w:rPr>
           <w:b/>
           <w:bCs/>
+          <w:lang w:val="en"/>
         </w:rPr>
         <w:t xml:space="preserve">x402 toolkit</w:t>
       </w:r>
@@ -140,6 +187,9 @@
         <w:pStyle w:val="BodyText"/>
       </w:pPr>
       <w:r>
+        <w:rPr>
+          <w:lang w:val="en"/>
+        </w:rPr>
         <w:t xml:space="preserve">Crawler paywall gateway ported to 7 languages and rolled out across the product fleet (32 PRs in one day), plus a Node payer client on Base.</w:t>
       </w:r>
     </w:p>
@@ -151,13 +201,20 @@
         <w:rPr>
           <w:b/>
           <w:bCs/>
+          <w:lang w:val="en"/>
         </w:rPr>
         <w:t xml:space="preserve">LogicSRC open specs</w:t>
       </w:r>
       <w:r>
-        <w:t xml:space="preserve"> </w:t>
-      </w:r>
-      <w:r>
+        <w:rPr>
+          <w:lang w:val="en"/>
+        </w:rPr>
+        <w:t xml:space="preserve"> </w:t>
+      </w:r>
+      <w:r>
+        <w:rPr>
+          <w:lang w:val="en"/>
+        </w:rPr>
         <w:t xml:space="preserve">(logicsrc.com)</w:t>
       </w:r>
     </w:p>
@@ -166,6 +223,9 @@
         <w:pStyle w:val="BodyText"/>
       </w:pPr>
       <w:r>
+        <w:rPr>
+          <w:lang w:val="en"/>
+        </w:rPr>
         <w:t xml:space="preserve">OpenProfile, OpenResume, OpenListing and related plain-Markdown specs for portable profiles and listings, with reference implementations.</w:t>
       </w:r>
     </w:p>
@@ -177,6 +237,7 @@
         <w:rPr>
           <w:b/>
           <w:bCs/>
+          <w:lang w:val="en"/>
         </w:rPr>
         <w:t xml:space="preserve">RSS Amplifier, NicheDB, TronBrowser, HQTUI, sh1pt</w:t>
       </w:r>
@@ -186,6 +247,9 @@
         <w:pStyle w:val="BodyText"/>
       </w:pPr>
       <w:r>
+        <w:rPr>
+          <w:lang w:val="en"/>
+        </w:rPr>
         <w:t xml:space="preserve">open web feed directory, niche data APIs, a privacy browser with its own push service, a zero-dependency TypeScript terminal UI library, and a multi-target ship/deploy CLI.</w:t>
       </w:r>
     </w:p>
@@ -197,6 +261,43 @@
         <w:rPr>
           <w:b/>
           <w:bCs/>
+          <w:lang w:val="en"/>
+        </w:rPr>
+        <w:t xml:space="preserve">Off The Record</w:t>
+      </w:r>
+      <w:r>
+        <w:rPr>
+          <w:lang w:val="en"/>
+        </w:rPr>
+        <w:t xml:space="preserve"> </w:t>
+      </w:r>
+      <w:r>
+        <w:rPr>
+          <w:lang w:val="en"/>
+        </w:rPr>
+        <w:t xml:space="preserve">(otr.podcast.pit.world)</w:t>
+      </w:r>
+    </w:p>
+    <w:p>
+      <w:pPr>
+        <w:pStyle w:val="BodyText"/>
+      </w:pPr>
+      <w:r>
+        <w:rPr>
+          <w:lang w:val="en"/>
+        </w:rPr>
+        <w:t xml:space="preserve">My long-form podcast on fleet engineering, agentic coding bots and building a new internet. An AI host interviews me over a recorded call; episodes are cleaned, titled and published automatically.</w:t>
+      </w:r>
+    </w:p>
+    <w:p>
+      <w:pPr>
+        <w:pStyle w:val="BodyText"/>
+      </w:pPr>
+      <w:r>
+        <w:rPr>
+          <w:b/>
+          <w:bCs/>
+          <w:lang w:val="en"/>
         </w:rPr>
         <w:t xml:space="preserve">Avenasea</w:t>
       </w:r>
@@ -206,6 +307,9 @@
         <w:pStyle w:val="BodyText"/>
       </w:pPr>
       <w:r>
+        <w:rPr>
+          <w:lang w:val="en"/>
+        </w:rPr>
         <w:t xml:space="preserve">Co-founded, served as CTO. Corporate travel platform.</w:t>
       </w:r>
     </w:p>
@@ -216,6 +320,9 @@
         <w:pStyle w:val="Heading2"/>
       </w:pPr>
       <w:r>
+        <w:rPr>
+          <w:lang w:val="en"/>
+        </w:rPr>
         <w:t xml:space="preserve">Core Skills</w:t>
       </w:r>
     </w:p>
@@ -227,141 +334,228 @@
         <w:rPr>
           <w:b/>
           <w:bCs/>
+          <w:lang w:val="en"/>
         </w:rPr>
         <w:t xml:space="preserve">Agentic development:</w:t>
       </w:r>
       <w:r>
-        <w:t xml:space="preserve"> </w:t>
-      </w:r>
-      <w:r>
+        <w:rPr>
+          <w:lang w:val="en"/>
+        </w:rPr>
+        <w:t xml:space="preserve"> </w:t>
+      </w:r>
+      <w:r>
+        <w:rPr>
+          <w:lang w:val="en"/>
+        </w:rPr>
         <w:t xml:space="preserve">Claude Code, Codex, Cursor, RooCode, Copilot, multi-agent orchestration, MCP servers, git-worktree parallelism, agent-driven CI and release</w:t>
       </w:r>
       <w:r>
+        <w:rPr>
+          <w:lang w:val="en"/>
+        </w:rPr>
         <w:t xml:space="preserve"> </w:t>
       </w:r>
       <w:r>
         <w:rPr>
           <w:b/>
           <w:bCs/>
+          <w:lang w:val="en"/>
         </w:rPr>
         <w:t xml:space="preserve">AI/LLM:</w:t>
       </w:r>
       <w:r>
-        <w:t xml:space="preserve"> </w:t>
-      </w:r>
-      <w:r>
+        <w:rPr>
+          <w:lang w:val="en"/>
+        </w:rPr>
+        <w:t xml:space="preserve"> </w:t>
+      </w:r>
+      <w:r>
+        <w:rPr>
+          <w:lang w:val="en"/>
+        </w:rPr>
         <w:t xml:space="preserve">Anthropic and OpenAI APIs, local LLMs, RAG, vLLM, AEO</w:t>
       </w:r>
       <w:r>
+        <w:rPr>
+          <w:lang w:val="en"/>
+        </w:rPr>
         <w:t xml:space="preserve"> </w:t>
       </w:r>
       <w:r>
         <w:rPr>
           <w:b/>
           <w:bCs/>
+          <w:lang w:val="en"/>
         </w:rPr>
         <w:t xml:space="preserve">Languages:</w:t>
       </w:r>
       <w:r>
-        <w:t xml:space="preserve"> </w:t>
-      </w:r>
-      <w:r>
+        <w:rPr>
+          <w:lang w:val="en"/>
+        </w:rPr>
+        <w:t xml:space="preserve"> </w:t>
+      </w:r>
+      <w:r>
+        <w:rPr>
+          <w:lang w:val="en"/>
+        </w:rPr>
         <w:t xml:space="preserve">JavaScript, TypeScript, Node.js, Bun, Go, PHP, Perl</w:t>
       </w:r>
       <w:r>
+        <w:rPr>
+          <w:lang w:val="en"/>
+        </w:rPr>
         <w:t xml:space="preserve"> </w:t>
       </w:r>
       <w:r>
         <w:rPr>
           <w:b/>
           <w:bCs/>
+          <w:lang w:val="en"/>
         </w:rPr>
         <w:t xml:space="preserve">Front-End:</w:t>
       </w:r>
       <w:r>
-        <w:t xml:space="preserve"> </w:t>
-      </w:r>
-      <w:r>
+        <w:rPr>
+          <w:lang w:val="en"/>
+        </w:rPr>
+        <w:t xml:space="preserve"> </w:t>
+      </w:r>
+      <w:r>
+        <w:rPr>
+          <w:lang w:val="en"/>
+        </w:rPr>
         <w:t xml:space="preserve">Svelte/SvelteKit, React, Next.js, Hono JSX, vanilla JS, Tailwind, PWAs, accessible UI</w:t>
       </w:r>
       <w:r>
+        <w:rPr>
+          <w:lang w:val="en"/>
+        </w:rPr>
         <w:t xml:space="preserve"> </w:t>
       </w:r>
       <w:r>
         <w:rPr>
           <w:b/>
           <w:bCs/>
+          <w:lang w:val="en"/>
         </w:rPr>
         <w:t xml:space="preserve">Back-End:</w:t>
       </w:r>
       <w:r>
-        <w:t xml:space="preserve"> </w:t>
-      </w:r>
-      <w:r>
+        <w:rPr>
+          <w:lang w:val="en"/>
+        </w:rPr>
+        <w:t xml:space="preserve"> </w:t>
+      </w:r>
+      <w:r>
+        <w:rPr>
+          <w:lang w:val="en"/>
+        </w:rPr>
         <w:t xml:space="preserve">Express, Fastify, Hono, REST, webhooks, magic-link and passkey auth, OAuth 2.1 + PKCE</w:t>
       </w:r>
       <w:r>
+        <w:rPr>
+          <w:lang w:val="en"/>
+        </w:rPr>
         <w:t xml:space="preserve"> </w:t>
       </w:r>
       <w:r>
         <w:rPr>
           <w:b/>
           <w:bCs/>
+          <w:lang w:val="en"/>
         </w:rPr>
         <w:t xml:space="preserve">Data:</w:t>
       </w:r>
       <w:r>
-        <w:t xml:space="preserve"> </w:t>
-      </w:r>
-      <w:r>
+        <w:rPr>
+          <w:lang w:val="en"/>
+        </w:rPr>
+        <w:t xml:space="preserve"> </w:t>
+      </w:r>
+      <w:r>
+        <w:rPr>
+          <w:lang w:val="en"/>
+        </w:rPr>
         <w:t xml:space="preserve">PostgreSQL, Supabase, Turso/libSQL, SQLite, MongoDB, full-text search</w:t>
       </w:r>
       <w:r>
+        <w:rPr>
+          <w:lang w:val="en"/>
+        </w:rPr>
         <w:t xml:space="preserve"> </w:t>
       </w:r>
       <w:r>
         <w:rPr>
           <w:b/>
           <w:bCs/>
+          <w:lang w:val="en"/>
         </w:rPr>
         <w:t xml:space="preserve">DevOps:</w:t>
       </w:r>
       <w:r>
-        <w:t xml:space="preserve"> </w:t>
-      </w:r>
-      <w:r>
+        <w:rPr>
+          <w:lang w:val="en"/>
+        </w:rPr>
+        <w:t xml:space="preserve"> </w:t>
+      </w:r>
+      <w:r>
+        <w:rPr>
+          <w:lang w:val="en"/>
+        </w:rPr>
         <w:t xml:space="preserve">Docker, GitHub Actions, Linux, NGINX, systemd, Railway, bare-metal deploys, CI/CD</w:t>
       </w:r>
       <w:r>
+        <w:rPr>
+          <w:lang w:val="en"/>
+        </w:rPr>
         <w:t xml:space="preserve"> </w:t>
       </w:r>
       <w:r>
         <w:rPr>
           <w:b/>
           <w:bCs/>
+          <w:lang w:val="en"/>
         </w:rPr>
         <w:t xml:space="preserve">Web3:</w:t>
       </w:r>
       <w:r>
-        <w:t xml:space="preserve"> </w:t>
-      </w:r>
-      <w:r>
+        <w:rPr>
+          <w:lang w:val="en"/>
+        </w:rPr>
+        <w:t xml:space="preserve"> </w:t>
+      </w:r>
+      <w:r>
+        <w:rPr>
+          <w:lang w:val="en"/>
+        </w:rPr>
         <w:t xml:space="preserve">Ethers.js, web3.js, Base, Polygon, USDC, x402, wallet integrations, non-custodial flows</w:t>
       </w:r>
       <w:r>
+        <w:rPr>
+          <w:lang w:val="en"/>
+        </w:rPr>
         <w:t xml:space="preserve"> </w:t>
       </w:r>
       <w:r>
         <w:rPr>
           <w:b/>
           <w:bCs/>
+          <w:lang w:val="en"/>
         </w:rPr>
         <w:t xml:space="preserve">Testing:</w:t>
       </w:r>
       <w:r>
-        <w:t xml:space="preserve"> </w:t>
-      </w:r>
-      <w:r>
+        <w:rPr>
+          <w:lang w:val="en"/>
+        </w:rPr>
+        <w:t xml:space="preserve"> </w:t>
+      </w:r>
+      <w:r>
+        <w:rPr>
+          <w:lang w:val="en"/>
+        </w:rPr>
         <w:t xml:space="preserve">Vitest, Jest, Chai, Playwright/Puppeteer, component and E2E patterns</w:t>
       </w:r>
     </w:p>
@@ -372,6 +566,9 @@
         <w:pStyle w:val="Heading2"/>
       </w:pPr>
       <w:r>
+        <w:rPr>
+          <w:lang w:val="en"/>
+        </w:rPr>
         <w:t xml:space="preserve">Work Experience</w:t>
       </w:r>
     </w:p>
@@ -383,6 +580,7 @@
         <w:rPr>
           <w:b/>
           <w:bCs/>
+          <w:lang w:val="en"/>
         </w:rPr>
         <w:t xml:space="preserve">Founder / Engineer</w:t>
       </w:r>
@@ -392,6 +590,9 @@
         <w:pStyle w:val="BodyText"/>
       </w:pPr>
       <w:r>
+        <w:rPr>
+          <w:lang w:val="en"/>
+        </w:rPr>
         <w:t xml:space="preserve">Profullstack, Inc.</w:t>
       </w:r>
     </w:p>
@@ -400,12 +601,21 @@
         <w:pStyle w:val="BodyText"/>
       </w:pPr>
       <w:r>
+        <w:rPr>
+          <w:lang w:val="en"/>
+        </w:rPr>
         <w:t xml:space="preserve">Mar 2018 – Present</w:t>
       </w:r>
       <w:r>
-        <w:t xml:space="preserve"> </w:t>
-      </w:r>
-      <w:r>
+        <w:rPr>
+          <w:lang w:val="en"/>
+        </w:rPr>
+        <w:t xml:space="preserve"> </w:t>
+      </w:r>
+      <w:r>
+        <w:rPr>
+          <w:lang w:val="en"/>
+        </w:rPr>
         <w:t xml:space="preserve">| Remote</w:t>
       </w:r>
     </w:p>
@@ -414,6 +624,9 @@
         <w:pStyle w:val="BodyText"/>
       </w:pPr>
       <w:r>
+        <w:rPr>
+          <w:lang w:val="en"/>
+        </w:rPr>
         <w:t xml:space="preserve">Founded and run a product studio and consultancy. Since 2025 I operate it as an agentic engineering shop: a fleet of AI coding agents builds, tests, releases and promotes every product, and I set the architecture, review the work and own production.</w:t>
       </w:r>
     </w:p>
@@ -426,6 +639,9 @@
         </w:numPr>
       </w:pPr>
       <w:r>
+        <w:rPr>
+          <w:lang w:val="en"/>
+        </w:rPr>
         <w:t xml:space="preserve">Shipped and operate 50+ live domains, each with a web app, CLI, MCP server and API on one codebase.</w:t>
       </w:r>
     </w:p>
@@ -438,6 +654,9 @@
         </w:numPr>
       </w:pPr>
       <w:r>
+        <w:rPr>
+          <w:lang w:val="en"/>
+        </w:rPr>
         <w:t xml:space="preserve">Built CoinPay, a non-custodial crypto payment gateway, and the x402 pay-per-request layer that meters AI crawlers and agents across the fleet.</w:t>
       </w:r>
     </w:p>
@@ -450,6 +669,9 @@
         </w:numPr>
       </w:pPr>
       <w:r>
+        <w:rPr>
+          <w:lang w:val="en"/>
+        </w:rPr>
         <w:t xml:space="preserve">Built CrawlProof (AEO tracking), Agentic Jobs (agent-to-agent hiring), ThreatCrush (security automation) and RSS Amplifier (open feed directory).</w:t>
       </w:r>
     </w:p>
@@ -462,6 +684,9 @@
         </w:numPr>
       </w:pPr>
       <w:r>
+        <w:rPr>
+          <w:lang w:val="en"/>
+        </w:rPr>
         <w:t xml:space="preserve">Wrote the LogicSRC open specs (OpenProfile, OpenResume, OpenListing) and the shared @profullstack packages that every product reuses.</w:t>
       </w:r>
     </w:p>
@@ -474,6 +699,9 @@
         </w:numPr>
       </w:pPr>
       <w:r>
+        <w:rPr>
+          <w:lang w:val="en"/>
+        </w:rPr>
         <w:t xml:space="preserve">Moved the fleet off managed cloud onto bare-metal boxes with systemd, NGINX and git-based deploys.</w:t>
       </w:r>
     </w:p>
@@ -486,6 +714,9 @@
         </w:numPr>
       </w:pPr>
       <w:r>
+        <w:rPr>
+          <w:lang w:val="en"/>
+        </w:rPr>
         <w:t xml:space="preserve">Consult on JavaScript/Node, Svelte, React, APIs, crypto payments and AI-assisted engineering. Co-founded Avenasea (CTO), led product and engineering.</w:t>
       </w:r>
     </w:p>
@@ -497,6 +728,7 @@
         <w:rPr>
           <w:b/>
           <w:bCs/>
+          <w:lang w:val="en"/>
         </w:rPr>
         <w:t xml:space="preserve">Principal Engineer</w:t>
       </w:r>
@@ -506,6 +738,9 @@
         <w:pStyle w:val="BodyText"/>
       </w:pPr>
       <w:r>
+        <w:rPr>
+          <w:lang w:val="en"/>
+        </w:rPr>
         <w:t xml:space="preserve">Prognos Health, Inc.</w:t>
       </w:r>
     </w:p>
@@ -514,12 +749,21 @@
         <w:pStyle w:val="BodyText"/>
       </w:pPr>
       <w:r>
+        <w:rPr>
+          <w:lang w:val="en"/>
+        </w:rPr>
         <w:t xml:space="preserve">Mar 2021 – Jan 2022</w:t>
       </w:r>
       <w:r>
-        <w:t xml:space="preserve"> </w:t>
-      </w:r>
-      <w:r>
+        <w:rPr>
+          <w:lang w:val="en"/>
+        </w:rPr>
+        <w:t xml:space="preserve"> </w:t>
+      </w:r>
+      <w:r>
+        <w:rPr>
+          <w:lang w:val="en"/>
+        </w:rPr>
         <w:t xml:space="preserve">| Remote</w:t>
       </w:r>
     </w:p>
@@ -528,6 +772,9 @@
         <w:pStyle w:val="BodyText"/>
       </w:pPr>
       <w:r>
+        <w:rPr>
+          <w:lang w:val="en"/>
+        </w:rPr>
         <w:t xml:space="preserve">Led SvelteKit rebuild of the healthcare underwriting UI. Shipped production components and improved data workflow usability for analytics teams.</w:t>
       </w:r>
     </w:p>
@@ -539,6 +786,7 @@
         <w:rPr>
           <w:b/>
           <w:bCs/>
+          <w:lang w:val="en"/>
         </w:rPr>
         <w:t xml:space="preserve">Senior Software Engineer</w:t>
       </w:r>
@@ -548,6 +796,9 @@
         <w:pStyle w:val="BodyText"/>
       </w:pPr>
       <w:r>
+        <w:rPr>
+          <w:lang w:val="en"/>
+        </w:rPr>
         <w:t xml:space="preserve">IBM (acquisition of StrongLoop)</w:t>
       </w:r>
     </w:p>
@@ -556,12 +807,21 @@
         <w:pStyle w:val="BodyText"/>
       </w:pPr>
       <w:r>
+        <w:rPr>
+          <w:lang w:val="en"/>
+        </w:rPr>
         <w:t xml:space="preserve">Nov 2014 – Mar 2018</w:t>
       </w:r>
       <w:r>
-        <w:t xml:space="preserve"> </w:t>
-      </w:r>
-      <w:r>
+        <w:rPr>
+          <w:lang w:val="en"/>
+        </w:rPr>
+        <w:t xml:space="preserve"> </w:t>
+      </w:r>
+      <w:r>
+        <w:rPr>
+          <w:lang w:val="en"/>
+        </w:rPr>
         <w:t xml:space="preserve">| Remote</w:t>
       </w:r>
     </w:p>
@@ -570,6 +830,9 @@
         <w:pStyle w:val="BodyText"/>
       </w:pPr>
       <w:r>
+        <w:rPr>
+          <w:lang w:val="en"/>
+        </w:rPr>
         <w:t xml:space="preserve">Post-acquisition: rebuilt the API Connect Editor from scratch. Established architecture patterns still in use. Drove internationalization, built global enterprise tooling, raised test coverage.</w:t>
       </w:r>
     </w:p>
@@ -581,6 +844,7 @@
         <w:rPr>
           <w:b/>
           <w:bCs/>
+          <w:lang w:val="en"/>
         </w:rPr>
         <w:t xml:space="preserve">Senior Software Engineer</w:t>
       </w:r>
@@ -590,6 +854,9 @@
         <w:pStyle w:val="BodyText"/>
       </w:pPr>
       <w:r>
+        <w:rPr>
+          <w:lang w:val="en"/>
+        </w:rPr>
         <w:t xml:space="preserve">Chegg Inc.</w:t>
       </w:r>
     </w:p>
@@ -598,12 +865,21 @@
         <w:pStyle w:val="BodyText"/>
       </w:pPr>
       <w:r>
+        <w:rPr>
+          <w:lang w:val="en"/>
+        </w:rPr>
         <w:t xml:space="preserve">Dec 2010 – Sept 2013</w:t>
       </w:r>
       <w:r>
-        <w:t xml:space="preserve"> </w:t>
-      </w:r>
-      <w:r>
+        <w:rPr>
+          <w:lang w:val="en"/>
+        </w:rPr>
+        <w:t xml:space="preserve"> </w:t>
+      </w:r>
+      <w:r>
+        <w:rPr>
+          <w:lang w:val="en"/>
+        </w:rPr>
         <w:t xml:space="preserve">| Santa Clara, CA</w:t>
       </w:r>
     </w:p>
@@ -612,6 +888,9 @@
         <w:pStyle w:val="BodyText"/>
       </w:pPr>
       <w:r>
+        <w:rPr>
+          <w:lang w:val="en"/>
+        </w:rPr>
         <w:t xml:space="preserve">E-commerce platform features for high-traffic education workflows. Dynamic front-ends from mocks in PHP, JavaScript, HTML, CSS. Test-driven development.</w:t>
       </w:r>
     </w:p>
@@ -623,6 +902,7 @@
         <w:rPr>
           <w:b/>
           <w:bCs/>
+          <w:lang w:val="en"/>
         </w:rPr>
         <w:t xml:space="preserve">Prototyper</w:t>
       </w:r>
@@ -632,6 +912,9 @@
         <w:pStyle w:val="BodyText"/>
       </w:pPr>
       <w:r>
+        <w:rPr>
+          <w:lang w:val="en"/>
+        </w:rPr>
         <w:t xml:space="preserve">Yahoo</w:t>
       </w:r>
     </w:p>
@@ -640,12 +923,21 @@
         <w:pStyle w:val="BodyText"/>
       </w:pPr>
       <w:r>
+        <w:rPr>
+          <w:lang w:val="en"/>
+        </w:rPr>
         <w:t xml:space="preserve">Jan 2010 – Dec 2010</w:t>
       </w:r>
       <w:r>
-        <w:t xml:space="preserve"> </w:t>
-      </w:r>
-      <w:r>
+        <w:rPr>
+          <w:lang w:val="en"/>
+        </w:rPr>
+        <w:t xml:space="preserve"> </w:t>
+      </w:r>
+      <w:r>
+        <w:rPr>
+          <w:lang w:val="en"/>
+        </w:rPr>
         <w:t xml:space="preserve">| Sunnyvale, CA</w:t>
       </w:r>
     </w:p>
@@ -654,6 +946,9 @@
         <w:pStyle w:val="BodyText"/>
       </w:pPr>
       <w:r>
+        <w:rPr>
+          <w:lang w:val="en"/>
+        </w:rPr>
         <w:t xml:space="preserve">Rapid prototyping with design teams. Responsive prototypes in jQuery, JavaScript, HTML, CSS. Mocked REST APIs for validation and user testing.</w:t>
       </w:r>
     </w:p>
@@ -665,6 +960,7 @@
         <w:rPr>
           <w:b/>
           <w:bCs/>
+          <w:lang w:val="en"/>
         </w:rPr>
         <w:t xml:space="preserve">Senior Web Developer</w:t>
       </w:r>
@@ -674,6 +970,9 @@
         <w:pStyle w:val="BodyText"/>
       </w:pPr>
       <w:r>
+        <w:rPr>
+          <w:lang w:val="en"/>
+        </w:rPr>
         <w:t xml:space="preserve">PayPal</w:t>
       </w:r>
     </w:p>
@@ -682,12 +981,21 @@
         <w:pStyle w:val="BodyText"/>
       </w:pPr>
       <w:r>
+        <w:rPr>
+          <w:lang w:val="en"/>
+        </w:rPr>
         <w:t xml:space="preserve">Oct 2003 – Jun 2006</w:t>
       </w:r>
       <w:r>
-        <w:t xml:space="preserve"> </w:t>
-      </w:r>
-      <w:r>
+        <w:rPr>
+          <w:lang w:val="en"/>
+        </w:rPr>
+        <w:t xml:space="preserve"> </w:t>
+      </w:r>
+      <w:r>
+        <w:rPr>
+          <w:lang w:val="en"/>
+        </w:rPr>
         <w:t xml:space="preserve">| San Jose, CA</w:t>
       </w:r>
     </w:p>
@@ -696,6 +1004,9 @@
         <w:pStyle w:val="BodyText"/>
       </w:pPr>
       <w:r>
+        <w:rPr>
+          <w:lang w:val="en"/>
+        </w:rPr>
         <w:t xml:space="preserve">XML Presentation Tier for the web architecture team. Perl, XML, JavaScript, HTML, CSS for large-scale payment platform interfaces.</w:t>
       </w:r>
     </w:p>
@@ -706,6 +1017,9 @@
         <w:pStyle w:val="Heading2"/>
       </w:pPr>
       <w:r>
+        <w:rPr>
+          <w:lang w:val="en"/>
+        </w:rPr>
         <w:t xml:space="preserve">Education &amp; Ongoing Study</w:t>
       </w:r>
     </w:p>
@@ -714,6 +1028,9 @@
         <w:pStyle w:val="FirstParagraph"/>
       </w:pPr>
       <w:r>
+        <w:rPr>
+          <w:lang w:val="en"/>
+        </w:rPr>
         <w:t xml:space="preserve">San Diego State University</w:t>
       </w:r>
     </w:p>
@@ -725,13 +1042,20 @@
         <w:rPr>
           <w:b/>
           <w:bCs/>
+          <w:lang w:val="en"/>
         </w:rPr>
         <w:t xml:space="preserve">B.S., Business Administration</w:t>
       </w:r>
       <w:r>
-        <w:t xml:space="preserve"> </w:t>
-      </w:r>
-      <w:r>
+        <w:rPr>
+          <w:lang w:val="en"/>
+        </w:rPr>
+        <w:t xml:space="preserve"> </w:t>
+      </w:r>
+      <w:r>
+        <w:rPr>
+          <w:lang w:val="en"/>
+        </w:rPr>
         <w:t xml:space="preserve">1993 – 1998</w:t>
       </w:r>
     </w:p>
@@ -740,6 +1064,9 @@
         <w:pStyle w:val="BodyText"/>
       </w:pPr>
       <w:r>
+        <w:rPr>
+          <w:lang w:val="en"/>
+        </w:rPr>
         <w:t xml:space="preserve">Currently studying distributed systems, parallel computing, fault tolerance and concurrency: MIT 6.824, Georgia Tech CS 7210, DelftX, Coursera/Rice HPC sequences.</w:t>
       </w:r>
     </w:p>
@@ -971,10 +1298,10 @@
   <w:docDefaults>
     <w:rPrDefault>
       <w:rPr>
-        <w:rFonts w:asciiTheme="minorHAnsi" w:cstheme="minorBidi" w:eastAsiaTheme="minorHAnsi" w:hAnsiTheme="minorHAnsi"/>
+        <w:rFonts w:asciiTheme="minorHAnsi" w:cstheme="minorBidi" w:eastAsiaTheme="minorEastAsia" w:hAnsiTheme="minorHAnsi"/>
         <w:sz w:val="24"/>
         <w:szCs w:val="24"/>
-        <w:lang w:bidi="ar-SA" w:eastAsia="en-US" w:val="en"/>
+        <w:lang w:bidi="ar-SA" w:eastAsia="zh-CN" w:val="en"/>
       </w:rPr>
     </w:rPrDefault>
     <w:pPrDefault>
@@ -1515,13 +1842,6 @@
       </w:tblCellMar>
     </w:tblPr>
     <w:tblStylePr w:type="firstRow">
-      <w:tblPr>
-        <w:jc w:val="left"/>
-        <w:tblInd w:type="dxa" w:w="0"/>
-      </w:tblPr>
-      <w:trPr>
-        <w:jc w:val="left"/>
-      </w:trPr>
       <w:tcPr>
         <w:tcBorders>
           <w:bottom w:val="single"/>

</xml_diff>